<commit_message>
actualizacion y borrar 40k
</commit_message>
<xml_diff>
--- a/Capitulos de Tesis/Capítulo IV.docx
+++ b/Capitulos de Tesis/Capítulo IV.docx
@@ -1,6 +1,6 @@
 
 <file path=word/document.xml><?xml version="1.0" encoding="utf-8"?>
-<w:document xmlns:wpc="http://schemas.microsoft.com/office/word/2010/wordprocessingCanvas" xmlns:cx="http://schemas.microsoft.com/office/drawing/2014/chartex" xmlns:cx1="http://schemas.microsoft.com/office/drawing/2015/9/8/chartex" xmlns:cx2="http://schemas.microsoft.com/office/drawing/2015/10/21/chartex" xmlns:cx3="http://schemas.microsoft.com/office/drawing/2016/5/9/chartex" xmlns:cx4="http://schemas.microsoft.com/office/drawing/2016/5/10/chartex" xmlns:cx5="http://schemas.microsoft.com/office/drawing/2016/5/11/chartex" xmlns:cx6="http://schemas.microsoft.com/office/drawing/2016/5/12/chartex" xmlns:cx7="http://schemas.microsoft.com/office/drawing/2016/5/13/chartex" xmlns:cx8="http://schemas.microsoft.com/office/drawing/2016/5/14/chartex" xmlns:mc="http://schemas.openxmlformats.org/markup-compatibility/2006" xmlns:aink="http://schemas.microsoft.com/office/drawing/2016/ink" xmlns:am3d="http://schemas.microsoft.com/office/drawing/2017/model3d" xmlns:o="urn:schemas-microsoft-com:office:office" xmlns:oel="http://schemas.microsoft.com/office/2019/extlst" xmlns:r="http://schemas.openxmlformats.org/officeDocument/2006/relationships" xmlns:m="http://schemas.openxmlformats.org/officeDocument/2006/math" xmlns:v="urn:schemas-microsoft-com:vml" xmlns:wp14="http://schemas.microsoft.com/office/word/2010/wordprocessingDrawing" xmlns:wp="http://schemas.openxmlformats.org/drawingml/2006/wordprocessingDrawing" xmlns:w10="urn:schemas-microsoft-com:office:word" xmlns:w="http://schemas.openxmlformats.org/wordprocessingml/2006/main" xmlns:w14="http://schemas.microsoft.com/office/word/2010/wordml" xmlns:w15="http://schemas.microsoft.com/office/word/2012/wordml" xmlns:w16cex="http://schemas.microsoft.com/office/word/2018/wordml/cex" xmlns:w16cid="http://schemas.microsoft.com/office/word/2016/wordml/cid" xmlns:w16="http://schemas.microsoft.com/office/word/2018/wordml" xmlns:w16sdtdh="http://schemas.microsoft.com/office/word/2020/wordml/sdtdatahash" xmlns:w16se="http://schemas.microsoft.com/office/word/2015/wordml/symex" xmlns:wpg="http://schemas.microsoft.com/office/word/2010/wordprocessingGroup" xmlns:wpi="http://schemas.microsoft.com/office/word/2010/wordprocessingInk" xmlns:wne="http://schemas.microsoft.com/office/word/2006/wordml" xmlns:wps="http://schemas.microsoft.com/office/word/2010/wordprocessingShape" mc:Ignorable="w14 w15 w16se w16cid w16 w16cex w16sdtdh wp14">
+<w:document xmlns:wpc="http://schemas.microsoft.com/office/word/2010/wordprocessingCanvas" xmlns:cx="http://schemas.microsoft.com/office/drawing/2014/chartex" xmlns:cx1="http://schemas.microsoft.com/office/drawing/2015/9/8/chartex" xmlns:cx2="http://schemas.microsoft.com/office/drawing/2015/10/21/chartex" xmlns:cx3="http://schemas.microsoft.com/office/drawing/2016/5/9/chartex" xmlns:cx4="http://schemas.microsoft.com/office/drawing/2016/5/10/chartex" xmlns:cx5="http://schemas.microsoft.com/office/drawing/2016/5/11/chartex" xmlns:cx6="http://schemas.microsoft.com/office/drawing/2016/5/12/chartex" xmlns:cx7="http://schemas.microsoft.com/office/drawing/2016/5/13/chartex" xmlns:cx8="http://schemas.microsoft.com/office/drawing/2016/5/14/chartex" xmlns:mc="http://schemas.openxmlformats.org/markup-compatibility/2006" xmlns:aink="http://schemas.microsoft.com/office/drawing/2016/ink" xmlns:am3d="http://schemas.microsoft.com/office/drawing/2017/model3d" xmlns:o="urn:schemas-microsoft-com:office:office" xmlns:oel="http://schemas.microsoft.com/office/2019/extlst" xmlns:r="http://schemas.openxmlformats.org/officeDocument/2006/relationships" xmlns:m="http://schemas.openxmlformats.org/officeDocument/2006/math" xmlns:v="urn:schemas-microsoft-com:vml" xmlns:wp14="http://schemas.microsoft.com/office/word/2010/wordprocessingDrawing" xmlns:wp="http://schemas.openxmlformats.org/drawingml/2006/wordprocessingDrawing" xmlns:w10="urn:schemas-microsoft-com:office:word" xmlns:w="http://schemas.openxmlformats.org/wordprocessingml/2006/main" xmlns:w14="http://schemas.microsoft.com/office/word/2010/wordml" xmlns:w15="http://schemas.microsoft.com/office/word/2012/wordml" xmlns:w16cex="http://schemas.microsoft.com/office/word/2018/wordml/cex" xmlns:w16cid="http://schemas.microsoft.com/office/word/2016/wordml/cid" xmlns:w16="http://schemas.microsoft.com/office/word/2018/wordml" xmlns:w16du="http://schemas.microsoft.com/office/word/2023/wordml/word16du" xmlns:w16sdtdh="http://schemas.microsoft.com/office/word/2020/wordml/sdtdatahash" xmlns:w16sdtfl="http://schemas.microsoft.com/office/word/2024/wordml/sdtformatlock" xmlns:w16se="http://schemas.microsoft.com/office/word/2015/wordml/symex" xmlns:wpg="http://schemas.microsoft.com/office/word/2010/wordprocessingGroup" xmlns:wpi="http://schemas.microsoft.com/office/word/2010/wordprocessingInk" xmlns:wne="http://schemas.microsoft.com/office/word/2006/wordml" xmlns:wps="http://schemas.microsoft.com/office/word/2010/wordprocessingShape" mc:Ignorable="w14 w15 w16se w16cid w16 w16cex w16sdtdh w16sdtfl w16du wp14">
   <w:body>
     <w:p/>
     <w:p>
@@ -262,7 +262,7 @@
               </wp:anchor>
             </w:drawing>
           </mc:Choice>
-          <mc:Fallback xmlns:w16du="http://schemas.microsoft.com/office/word/2023/wordml/word16du" xmlns:w16sdtfl="http://schemas.microsoft.com/office/word/2024/wordml/sdtformatlock">
+          <mc:Fallback>
             <w:pict>
               <v:group w14:anchorId="720B25CE" id="Group 17" o:spid="_x0000_s1026" style="position:absolute;margin-left:-4.45pt;margin-top:9.2pt;width:450.2pt;height:127.25pt;z-index:251659264" coordorigin="2268,6021" coordsize="8280,2340" o:gfxdata="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">
                 <v:shapetype id="_x0000_t75" coordsize="21600,21600" o:spt="75" o:preferrelative="t" path="m@4@5l@4@11@9@11@9@5xe" filled="f" stroked="f">
@@ -2583,7 +2583,7 @@
       </w:pPr>
       <w:r>
         <w:rPr>
-          <w:rStyle w:val="Textoennegrita"/>
+          <w:rStyle w:val="Fuerte"/>
           <w:rFonts w:eastAsiaTheme="majorEastAsia"/>
           <w:b w:val="0"/>
           <w:bCs w:val="0"/>
@@ -2593,7 +2593,7 @@
       </w:r>
       <w:r>
         <w:rPr>
-          <w:rStyle w:val="Textoennegrita"/>
+          <w:rStyle w:val="Fuerte"/>
           <w:rFonts w:eastAsiaTheme="majorEastAsia"/>
           <w:color w:val="000000" w:themeColor="text1"/>
         </w:rPr>
@@ -2601,7 +2601,7 @@
       </w:r>
       <w:r>
         <w:rPr>
-          <w:rStyle w:val="Textoennegrita"/>
+          <w:rStyle w:val="Fuerte"/>
           <w:rFonts w:eastAsiaTheme="majorEastAsia"/>
           <w:b w:val="0"/>
           <w:bCs w:val="0"/>
@@ -2611,7 +2611,7 @@
       </w:r>
       <w:r>
         <w:rPr>
-          <w:rStyle w:val="Textoennegrita"/>
+          <w:rStyle w:val="Fuerte"/>
           <w:rFonts w:eastAsiaTheme="majorEastAsia"/>
           <w:b w:val="0"/>
           <w:bCs w:val="0"/>
@@ -2621,7 +2621,7 @@
       </w:r>
       <w:r>
         <w:rPr>
-          <w:rStyle w:val="Textoennegrita"/>
+          <w:rStyle w:val="Fuerte"/>
           <w:rFonts w:eastAsiaTheme="majorEastAsia"/>
           <w:b w:val="0"/>
           <w:bCs w:val="0"/>
@@ -5307,7 +5307,7 @@
         <w:pStyle w:val="Tesis"/>
       </w:pPr>
       <w:r>
-        <w:t>Siguiendo con las otras vistas del programas, en el archivo ‘perfil_vista.py’</w:t>
+        <w:t>Siguiendo con las otras vistas del programa, en el archivo ‘perfil_vista.py’</w:t>
       </w:r>
       <w:r>
         <w:t xml:space="preserve"> se implement</w:t>
@@ -5608,7 +5608,7 @@
         </w:rPr>
         <w:lastRenderedPageBreak/>
         <w:drawing>
-          <wp:inline distT="0" distB="0" distL="0" distR="0" wp14:anchorId="43359052" wp14:editId="5F1EE1AC">
+          <wp:inline distT="0" distB="0" distL="0" distR="0" wp14:anchorId="43359052" wp14:editId="29BD3EBE">
             <wp:extent cx="4318635" cy="2258437"/>
             <wp:effectExtent l="0" t="0" r="5715" b="8890"/>
             <wp:docPr id="1785749341" name="Imagen 3"/>
@@ -7105,7 +7105,6 @@
         <w:tc>
           <w:tcPr>
             <w:tcW w:w="2753" w:type="dxa"/>
-            <w:shd w:val="clear" w:color="auto" w:fill="auto"/>
           </w:tcPr>
           <w:p>
             <w:pPr>
@@ -7129,7 +7128,6 @@
         <w:tc>
           <w:tcPr>
             <w:tcW w:w="2754" w:type="dxa"/>
-            <w:shd w:val="clear" w:color="auto" w:fill="auto"/>
           </w:tcPr>
           <w:p>
             <w:pPr>
@@ -7153,7 +7151,6 @@
         <w:tc>
           <w:tcPr>
             <w:tcW w:w="2754" w:type="dxa"/>
-            <w:shd w:val="clear" w:color="auto" w:fill="auto"/>
           </w:tcPr>
           <w:p>
             <w:pPr>
@@ -7669,7 +7666,7 @@
 </file>
 
 <file path=word/endnotes.xml><?xml version="1.0" encoding="utf-8"?>
-<w:endnotes xmlns:wpc="http://schemas.microsoft.com/office/word/2010/wordprocessingCanvas" xmlns:cx="http://schemas.microsoft.com/office/drawing/2014/chartex" xmlns:cx1="http://schemas.microsoft.com/office/drawing/2015/9/8/chartex" xmlns:cx2="http://schemas.microsoft.com/office/drawing/2015/10/21/chartex" xmlns:cx3="http://schemas.microsoft.com/office/drawing/2016/5/9/chartex" xmlns:cx4="http://schemas.microsoft.com/office/drawing/2016/5/10/chartex" xmlns:cx5="http://schemas.microsoft.com/office/drawing/2016/5/11/chartex" xmlns:cx6="http://schemas.microsoft.com/office/drawing/2016/5/12/chartex" xmlns:cx7="http://schemas.microsoft.com/office/drawing/2016/5/13/chartex" xmlns:cx8="http://schemas.microsoft.com/office/drawing/2016/5/14/chartex" xmlns:mc="http://schemas.openxmlformats.org/markup-compatibility/2006" xmlns:aink="http://schemas.microsoft.com/office/drawing/2016/ink" xmlns:am3d="http://schemas.microsoft.com/office/drawing/2017/model3d" xmlns:o="urn:schemas-microsoft-com:office:office" xmlns:oel="http://schemas.microsoft.com/office/2019/extlst" xmlns:r="http://schemas.openxmlformats.org/officeDocument/2006/relationships" xmlns:m="http://schemas.openxmlformats.org/officeDocument/2006/math" xmlns:v="urn:schemas-microsoft-com:vml" xmlns:wp14="http://schemas.microsoft.com/office/word/2010/wordprocessingDrawing" xmlns:wp="http://schemas.openxmlformats.org/drawingml/2006/wordprocessingDrawing" xmlns:w10="urn:schemas-microsoft-com:office:word" xmlns:w="http://schemas.openxmlformats.org/wordprocessingml/2006/main" xmlns:w14="http://schemas.microsoft.com/office/word/2010/wordml" xmlns:w15="http://schemas.microsoft.com/office/word/2012/wordml" xmlns:w16cex="http://schemas.microsoft.com/office/word/2018/wordml/cex" xmlns:w16cid="http://schemas.microsoft.com/office/word/2016/wordml/cid" xmlns:w16="http://schemas.microsoft.com/office/word/2018/wordml" xmlns:w16sdtdh="http://schemas.microsoft.com/office/word/2020/wordml/sdtdatahash" xmlns:w16se="http://schemas.microsoft.com/office/word/2015/wordml/symex" xmlns:wpg="http://schemas.microsoft.com/office/word/2010/wordprocessingGroup" xmlns:wpi="http://schemas.microsoft.com/office/word/2010/wordprocessingInk" xmlns:wne="http://schemas.microsoft.com/office/word/2006/wordml" xmlns:wps="http://schemas.microsoft.com/office/word/2010/wordprocessingShape" mc:Ignorable="w14 w15 w16se w16cid w16 w16cex w16sdtdh wp14">
+<w:endnotes xmlns:wpc="http://schemas.microsoft.com/office/word/2010/wordprocessingCanvas" xmlns:cx="http://schemas.microsoft.com/office/drawing/2014/chartex" xmlns:cx1="http://schemas.microsoft.com/office/drawing/2015/9/8/chartex" xmlns:cx2="http://schemas.microsoft.com/office/drawing/2015/10/21/chartex" xmlns:cx3="http://schemas.microsoft.com/office/drawing/2016/5/9/chartex" xmlns:cx4="http://schemas.microsoft.com/office/drawing/2016/5/10/chartex" xmlns:cx5="http://schemas.microsoft.com/office/drawing/2016/5/11/chartex" xmlns:cx6="http://schemas.microsoft.com/office/drawing/2016/5/12/chartex" xmlns:cx7="http://schemas.microsoft.com/office/drawing/2016/5/13/chartex" xmlns:cx8="http://schemas.microsoft.com/office/drawing/2016/5/14/chartex" xmlns:mc="http://schemas.openxmlformats.org/markup-compatibility/2006" xmlns:aink="http://schemas.microsoft.com/office/drawing/2016/ink" xmlns:am3d="http://schemas.microsoft.com/office/drawing/2017/model3d" xmlns:o="urn:schemas-microsoft-com:office:office" xmlns:oel="http://schemas.microsoft.com/office/2019/extlst" xmlns:r="http://schemas.openxmlformats.org/officeDocument/2006/relationships" xmlns:m="http://schemas.openxmlformats.org/officeDocument/2006/math" xmlns:v="urn:schemas-microsoft-com:vml" xmlns:wp14="http://schemas.microsoft.com/office/word/2010/wordprocessingDrawing" xmlns:wp="http://schemas.openxmlformats.org/drawingml/2006/wordprocessingDrawing" xmlns:w10="urn:schemas-microsoft-com:office:word" xmlns:w="http://schemas.openxmlformats.org/wordprocessingml/2006/main" xmlns:w14="http://schemas.microsoft.com/office/word/2010/wordml" xmlns:w15="http://schemas.microsoft.com/office/word/2012/wordml" xmlns:w16cex="http://schemas.microsoft.com/office/word/2018/wordml/cex" xmlns:w16cid="http://schemas.microsoft.com/office/word/2016/wordml/cid" xmlns:w16="http://schemas.microsoft.com/office/word/2018/wordml" xmlns:w16du="http://schemas.microsoft.com/office/word/2023/wordml/word16du" xmlns:w16sdtdh="http://schemas.microsoft.com/office/word/2020/wordml/sdtdatahash" xmlns:w16sdtfl="http://schemas.microsoft.com/office/word/2024/wordml/sdtformatlock" xmlns:w16se="http://schemas.microsoft.com/office/word/2015/wordml/symex" xmlns:wpg="http://schemas.microsoft.com/office/word/2010/wordprocessingGroup" xmlns:wpi="http://schemas.microsoft.com/office/word/2010/wordprocessingInk" xmlns:wne="http://schemas.microsoft.com/office/word/2006/wordml" xmlns:wps="http://schemas.microsoft.com/office/word/2010/wordprocessingShape" mc:Ignorable="w14 w15 w16se w16cid w16 w16cex w16sdtdh w16sdtfl w16du wp14">
   <w:endnote w:type="separator" w:id="-1">
     <w:p>
       <w:r>
@@ -7688,7 +7685,7 @@
 </file>
 
 <file path=word/footnotes.xml><?xml version="1.0" encoding="utf-8"?>
-<w:footnotes xmlns:wpc="http://schemas.microsoft.com/office/word/2010/wordprocessingCanvas" xmlns:cx="http://schemas.microsoft.com/office/drawing/2014/chartex" xmlns:cx1="http://schemas.microsoft.com/office/drawing/2015/9/8/chartex" xmlns:cx2="http://schemas.microsoft.com/office/drawing/2015/10/21/chartex" xmlns:cx3="http://schemas.microsoft.com/office/drawing/2016/5/9/chartex" xmlns:cx4="http://schemas.microsoft.com/office/drawing/2016/5/10/chartex" xmlns:cx5="http://schemas.microsoft.com/office/drawing/2016/5/11/chartex" xmlns:cx6="http://schemas.microsoft.com/office/drawing/2016/5/12/chartex" xmlns:cx7="http://schemas.microsoft.com/office/drawing/2016/5/13/chartex" xmlns:cx8="http://schemas.microsoft.com/office/drawing/2016/5/14/chartex" xmlns:mc="http://schemas.openxmlformats.org/markup-compatibility/2006" xmlns:aink="http://schemas.microsoft.com/office/drawing/2016/ink" xmlns:am3d="http://schemas.microsoft.com/office/drawing/2017/model3d" xmlns:o="urn:schemas-microsoft-com:office:office" xmlns:oel="http://schemas.microsoft.com/office/2019/extlst" xmlns:r="http://schemas.openxmlformats.org/officeDocument/2006/relationships" xmlns:m="http://schemas.openxmlformats.org/officeDocument/2006/math" xmlns:v="urn:schemas-microsoft-com:vml" xmlns:wp14="http://schemas.microsoft.com/office/word/2010/wordprocessingDrawing" xmlns:wp="http://schemas.openxmlformats.org/drawingml/2006/wordprocessingDrawing" xmlns:w10="urn:schemas-microsoft-com:office:word" xmlns:w="http://schemas.openxmlformats.org/wordprocessingml/2006/main" xmlns:w14="http://schemas.microsoft.com/office/word/2010/wordml" xmlns:w15="http://schemas.microsoft.com/office/word/2012/wordml" xmlns:w16cex="http://schemas.microsoft.com/office/word/2018/wordml/cex" xmlns:w16cid="http://schemas.microsoft.com/office/word/2016/wordml/cid" xmlns:w16="http://schemas.microsoft.com/office/word/2018/wordml" xmlns:w16sdtdh="http://schemas.microsoft.com/office/word/2020/wordml/sdtdatahash" xmlns:w16se="http://schemas.microsoft.com/office/word/2015/wordml/symex" xmlns:wpg="http://schemas.microsoft.com/office/word/2010/wordprocessingGroup" xmlns:wpi="http://schemas.microsoft.com/office/word/2010/wordprocessingInk" xmlns:wne="http://schemas.microsoft.com/office/word/2006/wordml" xmlns:wps="http://schemas.microsoft.com/office/word/2010/wordprocessingShape" mc:Ignorable="w14 w15 w16se w16cid w16 w16cex w16sdtdh wp14">
+<w:footnotes xmlns:wpc="http://schemas.microsoft.com/office/word/2010/wordprocessingCanvas" xmlns:cx="http://schemas.microsoft.com/office/drawing/2014/chartex" xmlns:cx1="http://schemas.microsoft.com/office/drawing/2015/9/8/chartex" xmlns:cx2="http://schemas.microsoft.com/office/drawing/2015/10/21/chartex" xmlns:cx3="http://schemas.microsoft.com/office/drawing/2016/5/9/chartex" xmlns:cx4="http://schemas.microsoft.com/office/drawing/2016/5/10/chartex" xmlns:cx5="http://schemas.microsoft.com/office/drawing/2016/5/11/chartex" xmlns:cx6="http://schemas.microsoft.com/office/drawing/2016/5/12/chartex" xmlns:cx7="http://schemas.microsoft.com/office/drawing/2016/5/13/chartex" xmlns:cx8="http://schemas.microsoft.com/office/drawing/2016/5/14/chartex" xmlns:mc="http://schemas.openxmlformats.org/markup-compatibility/2006" xmlns:aink="http://schemas.microsoft.com/office/drawing/2016/ink" xmlns:am3d="http://schemas.microsoft.com/office/drawing/2017/model3d" xmlns:o="urn:schemas-microsoft-com:office:office" xmlns:oel="http://schemas.microsoft.com/office/2019/extlst" xmlns:r="http://schemas.openxmlformats.org/officeDocument/2006/relationships" xmlns:m="http://schemas.openxmlformats.org/officeDocument/2006/math" xmlns:v="urn:schemas-microsoft-com:vml" xmlns:wp14="http://schemas.microsoft.com/office/word/2010/wordprocessingDrawing" xmlns:wp="http://schemas.openxmlformats.org/drawingml/2006/wordprocessingDrawing" xmlns:w10="urn:schemas-microsoft-com:office:word" xmlns:w="http://schemas.openxmlformats.org/wordprocessingml/2006/main" xmlns:w14="http://schemas.microsoft.com/office/word/2010/wordml" xmlns:w15="http://schemas.microsoft.com/office/word/2012/wordml" xmlns:w16cex="http://schemas.microsoft.com/office/word/2018/wordml/cex" xmlns:w16cid="http://schemas.microsoft.com/office/word/2016/wordml/cid" xmlns:w16="http://schemas.microsoft.com/office/word/2018/wordml" xmlns:w16du="http://schemas.microsoft.com/office/word/2023/wordml/word16du" xmlns:w16sdtdh="http://schemas.microsoft.com/office/word/2020/wordml/sdtdatahash" xmlns:w16sdtfl="http://schemas.microsoft.com/office/word/2024/wordml/sdtformatlock" xmlns:w16se="http://schemas.microsoft.com/office/word/2015/wordml/symex" xmlns:wpg="http://schemas.microsoft.com/office/word/2010/wordprocessingGroup" xmlns:wpi="http://schemas.microsoft.com/office/word/2010/wordprocessingInk" xmlns:wne="http://schemas.microsoft.com/office/word/2006/wordml" xmlns:wps="http://schemas.microsoft.com/office/word/2010/wordprocessingShape" mc:Ignorable="w14 w15 w16se w16cid w16 w16cex w16sdtdh w16sdtfl w16du wp14">
   <w:footnote w:type="separator" w:id="-1">
     <w:p>
       <w:r>
@@ -7707,7 +7704,7 @@
 </file>
 
 <file path=word/numbering.xml><?xml version="1.0" encoding="utf-8"?>
-<w:numbering xmlns:wpc="http://schemas.microsoft.com/office/word/2010/wordprocessingCanvas" xmlns:cx="http://schemas.microsoft.com/office/drawing/2014/chartex" xmlns:cx1="http://schemas.microsoft.com/office/drawing/2015/9/8/chartex" xmlns:cx2="http://schemas.microsoft.com/office/drawing/2015/10/21/chartex" xmlns:cx3="http://schemas.microsoft.com/office/drawing/2016/5/9/chartex" xmlns:cx4="http://schemas.microsoft.com/office/drawing/2016/5/10/chartex" xmlns:cx5="http://schemas.microsoft.com/office/drawing/2016/5/11/chartex" xmlns:cx6="http://schemas.microsoft.com/office/drawing/2016/5/12/chartex" xmlns:cx7="http://schemas.microsoft.com/office/drawing/2016/5/13/chartex" xmlns:cx8="http://schemas.microsoft.com/office/drawing/2016/5/14/chartex" xmlns:mc="http://schemas.openxmlformats.org/markup-compatibility/2006" xmlns:aink="http://schemas.microsoft.com/office/drawing/2016/ink" xmlns:am3d="http://schemas.microsoft.com/office/drawing/2017/model3d" xmlns:o="urn:schemas-microsoft-com:office:office" xmlns:oel="http://schemas.microsoft.com/office/2019/extlst" xmlns:r="http://schemas.openxmlformats.org/officeDocument/2006/relationships" xmlns:m="http://schemas.openxmlformats.org/officeDocument/2006/math" xmlns:v="urn:schemas-microsoft-com:vml" xmlns:wp14="http://schemas.microsoft.com/office/word/2010/wordprocessingDrawing" xmlns:wp="http://schemas.openxmlformats.org/drawingml/2006/wordprocessingDrawing" xmlns:w10="urn:schemas-microsoft-com:office:word" xmlns:w="http://schemas.openxmlformats.org/wordprocessingml/2006/main" xmlns:w14="http://schemas.microsoft.com/office/word/2010/wordml" xmlns:w15="http://schemas.microsoft.com/office/word/2012/wordml" xmlns:w16cex="http://schemas.microsoft.com/office/word/2018/wordml/cex" xmlns:w16cid="http://schemas.microsoft.com/office/word/2016/wordml/cid" xmlns:w16="http://schemas.microsoft.com/office/word/2018/wordml" xmlns:w16sdtdh="http://schemas.microsoft.com/office/word/2020/wordml/sdtdatahash" xmlns:w16se="http://schemas.microsoft.com/office/word/2015/wordml/symex" xmlns:wpg="http://schemas.microsoft.com/office/word/2010/wordprocessingGroup" xmlns:wpi="http://schemas.microsoft.com/office/word/2010/wordprocessingInk" xmlns:wne="http://schemas.microsoft.com/office/word/2006/wordml" xmlns:wps="http://schemas.microsoft.com/office/word/2010/wordprocessingShape" mc:Ignorable="w14 w15 w16se w16cid w16 w16cex w16sdtdh wp14">
+<w:numbering xmlns:wpc="http://schemas.microsoft.com/office/word/2010/wordprocessingCanvas" xmlns:cx="http://schemas.microsoft.com/office/drawing/2014/chartex" xmlns:cx1="http://schemas.microsoft.com/office/drawing/2015/9/8/chartex" xmlns:cx2="http://schemas.microsoft.com/office/drawing/2015/10/21/chartex" xmlns:cx3="http://schemas.microsoft.com/office/drawing/2016/5/9/chartex" xmlns:cx4="http://schemas.microsoft.com/office/drawing/2016/5/10/chartex" xmlns:cx5="http://schemas.microsoft.com/office/drawing/2016/5/11/chartex" xmlns:cx6="http://schemas.microsoft.com/office/drawing/2016/5/12/chartex" xmlns:cx7="http://schemas.microsoft.com/office/drawing/2016/5/13/chartex" xmlns:cx8="http://schemas.microsoft.com/office/drawing/2016/5/14/chartex" xmlns:mc="http://schemas.openxmlformats.org/markup-compatibility/2006" xmlns:aink="http://schemas.microsoft.com/office/drawing/2016/ink" xmlns:am3d="http://schemas.microsoft.com/office/drawing/2017/model3d" xmlns:o="urn:schemas-microsoft-com:office:office" xmlns:oel="http://schemas.microsoft.com/office/2019/extlst" xmlns:r="http://schemas.openxmlformats.org/officeDocument/2006/relationships" xmlns:m="http://schemas.openxmlformats.org/officeDocument/2006/math" xmlns:v="urn:schemas-microsoft-com:vml" xmlns:wp14="http://schemas.microsoft.com/office/word/2010/wordprocessingDrawing" xmlns:wp="http://schemas.openxmlformats.org/drawingml/2006/wordprocessingDrawing" xmlns:w10="urn:schemas-microsoft-com:office:word" xmlns:w="http://schemas.openxmlformats.org/wordprocessingml/2006/main" xmlns:w14="http://schemas.microsoft.com/office/word/2010/wordml" xmlns:w15="http://schemas.microsoft.com/office/word/2012/wordml" xmlns:w16cex="http://schemas.microsoft.com/office/word/2018/wordml/cex" xmlns:w16cid="http://schemas.microsoft.com/office/word/2016/wordml/cid" xmlns:w16="http://schemas.microsoft.com/office/word/2018/wordml" xmlns:w16du="http://schemas.microsoft.com/office/word/2023/wordml/word16du" xmlns:w16sdtdh="http://schemas.microsoft.com/office/word/2020/wordml/sdtdatahash" xmlns:w16sdtfl="http://schemas.microsoft.com/office/word/2024/wordml/sdtformatlock" xmlns:w16se="http://schemas.microsoft.com/office/word/2015/wordml/symex" xmlns:wpg="http://schemas.microsoft.com/office/word/2010/wordprocessingGroup" xmlns:wpi="http://schemas.microsoft.com/office/word/2010/wordprocessingInk" xmlns:wne="http://schemas.microsoft.com/office/word/2006/wordml" xmlns:wps="http://schemas.microsoft.com/office/word/2010/wordprocessingShape" mc:Ignorable="w14 w15 w16se w16cid w16 w16cex w16sdtdh w16sdtfl w16du wp14">
   <w:abstractNum w:abstractNumId="0" w15:restartNumberingAfterBreak="0">
     <w:nsid w:val="02C57005"/>
     <w:multiLevelType w:val="hybridMultilevel"/>
@@ -8096,7 +8093,7 @@
 </file>
 
 <file path=word/styles.xml><?xml version="1.0" encoding="utf-8"?>
-<w:styles xmlns:mc="http://schemas.openxmlformats.org/markup-compatibility/2006" xmlns:r="http://schemas.openxmlformats.org/officeDocument/2006/relationships" xmlns:w="http://schemas.openxmlformats.org/wordprocessingml/2006/main" xmlns:w14="http://schemas.microsoft.com/office/word/2010/wordml" xmlns:w15="http://schemas.microsoft.com/office/word/2012/wordml" xmlns:w16cex="http://schemas.microsoft.com/office/word/2018/wordml/cex" xmlns:w16cid="http://schemas.microsoft.com/office/word/2016/wordml/cid" xmlns:w16="http://schemas.microsoft.com/office/word/2018/wordml" xmlns:w16sdtdh="http://schemas.microsoft.com/office/word/2020/wordml/sdtdatahash" xmlns:w16se="http://schemas.microsoft.com/office/word/2015/wordml/symex" mc:Ignorable="w14 w15 w16se w16cid w16 w16cex w16sdtdh">
+<w:styles xmlns:mc="http://schemas.openxmlformats.org/markup-compatibility/2006" xmlns:r="http://schemas.openxmlformats.org/officeDocument/2006/relationships" xmlns:w="http://schemas.openxmlformats.org/wordprocessingml/2006/main" xmlns:w14="http://schemas.microsoft.com/office/word/2010/wordml" xmlns:w15="http://schemas.microsoft.com/office/word/2012/wordml" xmlns:w16cex="http://schemas.microsoft.com/office/word/2018/wordml/cex" xmlns:w16cid="http://schemas.microsoft.com/office/word/2016/wordml/cid" xmlns:w16="http://schemas.microsoft.com/office/word/2018/wordml" xmlns:w16du="http://schemas.microsoft.com/office/word/2023/wordml/word16du" xmlns:w16sdtdh="http://schemas.microsoft.com/office/word/2020/wordml/sdtdatahash" xmlns:w16sdtfl="http://schemas.microsoft.com/office/word/2024/wordml/sdtformatlock" xmlns:w16se="http://schemas.microsoft.com/office/word/2015/wordml/symex" mc:Ignorable="w14 w15 w16se w16cid w16 w16cex w16sdtdh w16sdtfl w16du">
   <w:docDefaults>
     <w:rPrDefault>
       <w:rPr>
@@ -9240,7 +9237,7 @@
       <w:lang w:val="es-VE"/>
     </w:rPr>
   </w:style>
-  <w:style w:type="character" w:styleId="Textoennegrita">
+  <w:style w:type="character" w:styleId="Fuerte">
     <w:name w:val="Strong"/>
     <w:basedOn w:val="Fuentedeprrafopredeter"/>
     <w:uiPriority w:val="22"/>
@@ -9295,7 +9292,7 @@
 <file path=word/charts/chart1.xml><?xml version="1.0" encoding="utf-8"?>
 <c:chartSpace xmlns:c="http://schemas.openxmlformats.org/drawingml/2006/chart" xmlns:a="http://schemas.openxmlformats.org/drawingml/2006/main" xmlns:r="http://schemas.openxmlformats.org/officeDocument/2006/relationships" xmlns:c16r2="http://schemas.microsoft.com/office/drawing/2015/06/chart">
   <c:date1904 val="0"/>
-  <c:lang val="es-ES"/>
+  <c:lang val="es-MX"/>
   <c:roundedCorners val="0"/>
   <mc:AlternateContent xmlns:mc="http://schemas.openxmlformats.org/markup-compatibility/2006">
     <mc:Choice xmlns:c14="http://schemas.microsoft.com/office/drawing/2007/8/2/chart" Requires="c14">
@@ -9756,6 +9753,7 @@
     </c:legend>
     <c:plotVisOnly val="1"/>
     <c:dispBlanksAs val="gap"/>
+    <c:showDLblsOverMax val="0"/>
     <c:extLst>
       <c:ext xmlns:c16r3="http://schemas.microsoft.com/office/drawing/2017/03/chart" uri="{56B9EC1D-385E-4148-901F-78D8002777C0}">
         <c16r3:dataDisplayOptions16>
@@ -9763,7 +9761,6 @@
         </c16r3:dataDisplayOptions16>
       </c:ext>
     </c:extLst>
-    <c:showDLblsOverMax val="0"/>
   </c:chart>
   <c:spPr>
     <a:noFill/>
@@ -9798,7 +9795,7 @@
 <file path=word/charts/chart10.xml><?xml version="1.0" encoding="utf-8"?>
 <c:chartSpace xmlns:c="http://schemas.openxmlformats.org/drawingml/2006/chart" xmlns:a="http://schemas.openxmlformats.org/drawingml/2006/main" xmlns:r="http://schemas.openxmlformats.org/officeDocument/2006/relationships" xmlns:c16r2="http://schemas.microsoft.com/office/drawing/2015/06/chart">
   <c:date1904 val="0"/>
-  <c:lang val="es-ES"/>
+  <c:lang val="es-MX"/>
   <c:roundedCorners val="0"/>
   <mc:AlternateContent xmlns:mc="http://schemas.openxmlformats.org/markup-compatibility/2006">
     <mc:Choice xmlns:c14="http://schemas.microsoft.com/office/drawing/2007/8/2/chart" Requires="c14">
@@ -10125,6 +10122,7 @@
     </c:legend>
     <c:plotVisOnly val="1"/>
     <c:dispBlanksAs val="gap"/>
+    <c:showDLblsOverMax val="0"/>
     <c:extLst>
       <c:ext xmlns:c16r3="http://schemas.microsoft.com/office/drawing/2017/03/chart" uri="{56B9EC1D-385E-4148-901F-78D8002777C0}">
         <c16r3:dataDisplayOptions16>
@@ -10132,7 +10130,6 @@
         </c16r3:dataDisplayOptions16>
       </c:ext>
     </c:extLst>
-    <c:showDLblsOverMax val="0"/>
   </c:chart>
   <c:spPr>
     <a:solidFill>
@@ -10169,7 +10166,7 @@
 <file path=word/charts/chart11.xml><?xml version="1.0" encoding="utf-8"?>
 <c:chartSpace xmlns:c="http://schemas.openxmlformats.org/drawingml/2006/chart" xmlns:a="http://schemas.openxmlformats.org/drawingml/2006/main" xmlns:r="http://schemas.openxmlformats.org/officeDocument/2006/relationships" xmlns:c16r2="http://schemas.microsoft.com/office/drawing/2015/06/chart">
   <c:date1904 val="0"/>
-  <c:lang val="es-ES"/>
+  <c:lang val="es-MX"/>
   <c:roundedCorners val="0"/>
   <mc:AlternateContent xmlns:mc="http://schemas.openxmlformats.org/markup-compatibility/2006">
     <mc:Choice xmlns:c14="http://schemas.microsoft.com/office/drawing/2007/8/2/chart" Requires="c14">
@@ -10496,6 +10493,7 @@
     </c:legend>
     <c:plotVisOnly val="1"/>
     <c:dispBlanksAs val="gap"/>
+    <c:showDLblsOverMax val="0"/>
     <c:extLst>
       <c:ext xmlns:c16r3="http://schemas.microsoft.com/office/drawing/2017/03/chart" uri="{56B9EC1D-385E-4148-901F-78D8002777C0}">
         <c16r3:dataDisplayOptions16>
@@ -10503,7 +10501,6 @@
         </c16r3:dataDisplayOptions16>
       </c:ext>
     </c:extLst>
-    <c:showDLblsOverMax val="0"/>
   </c:chart>
   <c:spPr>
     <a:solidFill>
@@ -10540,7 +10537,7 @@
 <file path=word/charts/chart12.xml><?xml version="1.0" encoding="utf-8"?>
 <c:chartSpace xmlns:c="http://schemas.openxmlformats.org/drawingml/2006/chart" xmlns:a="http://schemas.openxmlformats.org/drawingml/2006/main" xmlns:r="http://schemas.openxmlformats.org/officeDocument/2006/relationships" xmlns:c16r2="http://schemas.microsoft.com/office/drawing/2015/06/chart">
   <c:date1904 val="0"/>
-  <c:lang val="es-ES"/>
+  <c:lang val="es-MX"/>
   <c:roundedCorners val="0"/>
   <mc:AlternateContent xmlns:mc="http://schemas.openxmlformats.org/markup-compatibility/2006">
     <mc:Choice xmlns:c14="http://schemas.microsoft.com/office/drawing/2007/8/2/chart" Requires="c14">
@@ -10867,6 +10864,7 @@
     </c:legend>
     <c:plotVisOnly val="1"/>
     <c:dispBlanksAs val="gap"/>
+    <c:showDLblsOverMax val="0"/>
     <c:extLst>
       <c:ext xmlns:c16r3="http://schemas.microsoft.com/office/drawing/2017/03/chart" uri="{56B9EC1D-385E-4148-901F-78D8002777C0}">
         <c16r3:dataDisplayOptions16>
@@ -10874,7 +10872,6 @@
         </c16r3:dataDisplayOptions16>
       </c:ext>
     </c:extLst>
-    <c:showDLblsOverMax val="0"/>
   </c:chart>
   <c:spPr>
     <a:solidFill>
@@ -10911,7 +10908,7 @@
 <file path=word/charts/chart2.xml><?xml version="1.0" encoding="utf-8"?>
 <c:chartSpace xmlns:c="http://schemas.openxmlformats.org/drawingml/2006/chart" xmlns:a="http://schemas.openxmlformats.org/drawingml/2006/main" xmlns:r="http://schemas.openxmlformats.org/officeDocument/2006/relationships" xmlns:c16r2="http://schemas.microsoft.com/office/drawing/2015/06/chart">
   <c:date1904 val="0"/>
-  <c:lang val="es-ES"/>
+  <c:lang val="es-MX"/>
   <c:roundedCorners val="0"/>
   <mc:AlternateContent xmlns:mc="http://schemas.openxmlformats.org/markup-compatibility/2006">
     <mc:Choice xmlns:c14="http://schemas.microsoft.com/office/drawing/2007/8/2/chart" Requires="c14">
@@ -11284,6 +11281,7 @@
     </c:legend>
     <c:plotVisOnly val="1"/>
     <c:dispBlanksAs val="gap"/>
+    <c:showDLblsOverMax val="0"/>
     <c:extLst>
       <c:ext xmlns:c16r3="http://schemas.microsoft.com/office/drawing/2017/03/chart" uri="{56B9EC1D-385E-4148-901F-78D8002777C0}">
         <c16r3:dataDisplayOptions16>
@@ -11291,7 +11289,6 @@
         </c16r3:dataDisplayOptions16>
       </c:ext>
     </c:extLst>
-    <c:showDLblsOverMax val="0"/>
   </c:chart>
   <c:spPr>
     <a:solidFill>
@@ -11328,7 +11325,7 @@
 <file path=word/charts/chart3.xml><?xml version="1.0" encoding="utf-8"?>
 <c:chartSpace xmlns:c="http://schemas.openxmlformats.org/drawingml/2006/chart" xmlns:a="http://schemas.openxmlformats.org/drawingml/2006/main" xmlns:r="http://schemas.openxmlformats.org/officeDocument/2006/relationships" xmlns:c16r2="http://schemas.microsoft.com/office/drawing/2015/06/chart">
   <c:date1904 val="0"/>
-  <c:lang val="es-ES"/>
+  <c:lang val="es-MX"/>
   <c:roundedCorners val="0"/>
   <mc:AlternateContent xmlns:mc="http://schemas.openxmlformats.org/markup-compatibility/2006">
     <mc:Choice xmlns:c14="http://schemas.microsoft.com/office/drawing/2007/8/2/chart" Requires="c14">
@@ -11603,6 +11600,7 @@
     </c:legend>
     <c:plotVisOnly val="1"/>
     <c:dispBlanksAs val="gap"/>
+    <c:showDLblsOverMax val="0"/>
     <c:extLst>
       <c:ext xmlns:c16r3="http://schemas.microsoft.com/office/drawing/2017/03/chart" uri="{56B9EC1D-385E-4148-901F-78D8002777C0}">
         <c16r3:dataDisplayOptions16>
@@ -11610,7 +11608,6 @@
         </c16r3:dataDisplayOptions16>
       </c:ext>
     </c:extLst>
-    <c:showDLblsOverMax val="0"/>
   </c:chart>
   <c:spPr>
     <a:solidFill>
@@ -11647,7 +11644,7 @@
 <file path=word/charts/chart4.xml><?xml version="1.0" encoding="utf-8"?>
 <c:chartSpace xmlns:c="http://schemas.openxmlformats.org/drawingml/2006/chart" xmlns:a="http://schemas.openxmlformats.org/drawingml/2006/main" xmlns:r="http://schemas.openxmlformats.org/officeDocument/2006/relationships" xmlns:c16r2="http://schemas.microsoft.com/office/drawing/2015/06/chart">
   <c:date1904 val="0"/>
-  <c:lang val="es-ES"/>
+  <c:lang val="es-MX"/>
   <c:roundedCorners val="0"/>
   <mc:AlternateContent xmlns:mc="http://schemas.openxmlformats.org/markup-compatibility/2006">
     <mc:Choice xmlns:c14="http://schemas.microsoft.com/office/drawing/2007/8/2/chart" Requires="c14">
@@ -11952,6 +11949,7 @@
     </c:legend>
     <c:plotVisOnly val="1"/>
     <c:dispBlanksAs val="gap"/>
+    <c:showDLblsOverMax val="0"/>
     <c:extLst>
       <c:ext xmlns:c16r3="http://schemas.microsoft.com/office/drawing/2017/03/chart" uri="{56B9EC1D-385E-4148-901F-78D8002777C0}">
         <c16r3:dataDisplayOptions16>
@@ -11959,7 +11957,6 @@
         </c16r3:dataDisplayOptions16>
       </c:ext>
     </c:extLst>
-    <c:showDLblsOverMax val="0"/>
   </c:chart>
   <c:spPr>
     <a:solidFill>
@@ -11996,7 +11993,7 @@
 <file path=word/charts/chart5.xml><?xml version="1.0" encoding="utf-8"?>
 <c:chartSpace xmlns:c="http://schemas.openxmlformats.org/drawingml/2006/chart" xmlns:a="http://schemas.openxmlformats.org/drawingml/2006/main" xmlns:r="http://schemas.openxmlformats.org/officeDocument/2006/relationships" xmlns:c16r2="http://schemas.microsoft.com/office/drawing/2015/06/chart">
   <c:date1904 val="0"/>
-  <c:lang val="es-ES"/>
+  <c:lang val="es-MX"/>
   <c:roundedCorners val="0"/>
   <mc:AlternateContent xmlns:mc="http://schemas.openxmlformats.org/markup-compatibility/2006">
     <mc:Choice xmlns:c14="http://schemas.microsoft.com/office/drawing/2007/8/2/chart" Requires="c14">
@@ -12340,6 +12337,7 @@
     </c:legend>
     <c:plotVisOnly val="1"/>
     <c:dispBlanksAs val="gap"/>
+    <c:showDLblsOverMax val="0"/>
     <c:extLst>
       <c:ext xmlns:c16r3="http://schemas.microsoft.com/office/drawing/2017/03/chart" uri="{56B9EC1D-385E-4148-901F-78D8002777C0}">
         <c16r3:dataDisplayOptions16>
@@ -12347,7 +12345,6 @@
         </c16r3:dataDisplayOptions16>
       </c:ext>
     </c:extLst>
-    <c:showDLblsOverMax val="0"/>
   </c:chart>
   <c:spPr>
     <a:solidFill>
@@ -12387,7 +12384,7 @@
 <file path=word/charts/chart6.xml><?xml version="1.0" encoding="utf-8"?>
 <c:chartSpace xmlns:c="http://schemas.openxmlformats.org/drawingml/2006/chart" xmlns:a="http://schemas.openxmlformats.org/drawingml/2006/main" xmlns:r="http://schemas.openxmlformats.org/officeDocument/2006/relationships" xmlns:c16r2="http://schemas.microsoft.com/office/drawing/2015/06/chart">
   <c:date1904 val="0"/>
-  <c:lang val="es-ES"/>
+  <c:lang val="es-MX"/>
   <c:roundedCorners val="0"/>
   <mc:AlternateContent xmlns:mc="http://schemas.openxmlformats.org/markup-compatibility/2006">
     <mc:Choice xmlns:c14="http://schemas.microsoft.com/office/drawing/2007/8/2/chart" Requires="c14">
@@ -12698,6 +12695,7 @@
     </c:legend>
     <c:plotVisOnly val="1"/>
     <c:dispBlanksAs val="gap"/>
+    <c:showDLblsOverMax val="0"/>
     <c:extLst>
       <c:ext xmlns:c16r3="http://schemas.microsoft.com/office/drawing/2017/03/chart" uri="{56B9EC1D-385E-4148-901F-78D8002777C0}">
         <c16r3:dataDisplayOptions16>
@@ -12705,7 +12703,6 @@
         </c16r3:dataDisplayOptions16>
       </c:ext>
     </c:extLst>
-    <c:showDLblsOverMax val="0"/>
   </c:chart>
   <c:spPr>
     <a:solidFill>
@@ -12744,7 +12741,7 @@
 <file path=word/charts/chart7.xml><?xml version="1.0" encoding="utf-8"?>
 <c:chartSpace xmlns:c="http://schemas.openxmlformats.org/drawingml/2006/chart" xmlns:a="http://schemas.openxmlformats.org/drawingml/2006/main" xmlns:r="http://schemas.openxmlformats.org/officeDocument/2006/relationships" xmlns:c16r2="http://schemas.microsoft.com/office/drawing/2015/06/chart">
   <c:date1904 val="0"/>
-  <c:lang val="es-ES"/>
+  <c:lang val="es-MX"/>
   <c:roundedCorners val="0"/>
   <mc:AlternateContent xmlns:mc="http://schemas.openxmlformats.org/markup-compatibility/2006">
     <mc:Choice xmlns:c14="http://schemas.microsoft.com/office/drawing/2007/8/2/chart" Requires="c14">
@@ -13011,6 +13008,7 @@
     </c:legend>
     <c:plotVisOnly val="1"/>
     <c:dispBlanksAs val="gap"/>
+    <c:showDLblsOverMax val="0"/>
     <c:extLst>
       <c:ext xmlns:c16r3="http://schemas.microsoft.com/office/drawing/2017/03/chart" uri="{56B9EC1D-385E-4148-901F-78D8002777C0}">
         <c16r3:dataDisplayOptions16>
@@ -13018,7 +13016,6 @@
         </c16r3:dataDisplayOptions16>
       </c:ext>
     </c:extLst>
-    <c:showDLblsOverMax val="0"/>
   </c:chart>
   <c:spPr>
     <a:solidFill>
@@ -13055,7 +13052,7 @@
 <file path=word/charts/chart8.xml><?xml version="1.0" encoding="utf-8"?>
 <c:chartSpace xmlns:c="http://schemas.openxmlformats.org/drawingml/2006/chart" xmlns:a="http://schemas.openxmlformats.org/drawingml/2006/main" xmlns:r="http://schemas.openxmlformats.org/officeDocument/2006/relationships" xmlns:c16r2="http://schemas.microsoft.com/office/drawing/2015/06/chart">
   <c:date1904 val="0"/>
-  <c:lang val="es-ES"/>
+  <c:lang val="es-MX"/>
   <c:roundedCorners val="0"/>
   <mc:AlternateContent xmlns:mc="http://schemas.openxmlformats.org/markup-compatibility/2006">
     <mc:Choice xmlns:c14="http://schemas.microsoft.com/office/drawing/2007/8/2/chart" Requires="c14">
@@ -13414,6 +13411,7 @@
     </c:legend>
     <c:plotVisOnly val="1"/>
     <c:dispBlanksAs val="gap"/>
+    <c:showDLblsOverMax val="0"/>
     <c:extLst>
       <c:ext xmlns:c16r3="http://schemas.microsoft.com/office/drawing/2017/03/chart" uri="{56B9EC1D-385E-4148-901F-78D8002777C0}">
         <c16r3:dataDisplayOptions16>
@@ -13421,7 +13419,6 @@
         </c16r3:dataDisplayOptions16>
       </c:ext>
     </c:extLst>
-    <c:showDLblsOverMax val="0"/>
   </c:chart>
   <c:spPr>
     <a:solidFill>
@@ -13458,7 +13455,7 @@
 <file path=word/charts/chart9.xml><?xml version="1.0" encoding="utf-8"?>
 <c:chartSpace xmlns:c="http://schemas.openxmlformats.org/drawingml/2006/chart" xmlns:a="http://schemas.openxmlformats.org/drawingml/2006/main" xmlns:r="http://schemas.openxmlformats.org/officeDocument/2006/relationships" xmlns:c16r2="http://schemas.microsoft.com/office/drawing/2015/06/chart">
   <c:date1904 val="0"/>
-  <c:lang val="es-ES"/>
+  <c:lang val="es-MX"/>
   <c:roundedCorners val="0"/>
   <mc:AlternateContent xmlns:mc="http://schemas.openxmlformats.org/markup-compatibility/2006">
     <mc:Choice xmlns:c14="http://schemas.microsoft.com/office/drawing/2007/8/2/chart" Requires="c14">
@@ -14358,6 +14355,7 @@
     </c:legend>
     <c:plotVisOnly val="1"/>
     <c:dispBlanksAs val="gap"/>
+    <c:showDLblsOverMax val="0"/>
     <c:extLst>
       <c:ext xmlns:c16r3="http://schemas.microsoft.com/office/drawing/2017/03/chart" uri="{56B9EC1D-385E-4148-901F-78D8002777C0}">
         <c16r3:dataDisplayOptions16>
@@ -14365,7 +14363,6 @@
         </c16r3:dataDisplayOptions16>
       </c:ext>
     </c:extLst>
-    <c:showDLblsOverMax val="0"/>
   </c:chart>
   <c:spPr>
     <a:solidFill>

</xml_diff>